<commit_message>
Change React native random defaults to Android Material Design 3 :)
</commit_message>
<xml_diff>
--- a/TempResearch.docx
+++ b/TempResearch.docx
@@ -1399,6 +1399,153 @@
           <w:lang w:val="en-US"/>
         </w:rPr>
       </w:pPr>
+    </w:p>
+    <w:p>
+      <w:pPr>
+        <w:rPr>
+          <w:lang w:val="en-US"/>
+        </w:rPr>
+      </w:pPr>
+    </w:p>
+    <w:p>
+      <w:pPr>
+        <w:rPr>
+          <w:b/>
+          <w:bCs/>
+          <w:lang w:val="en-US"/>
+        </w:rPr>
+      </w:pPr>
+      <w:r>
+        <w:rPr>
+          <w:b/>
+          <w:bCs/>
+          <w:lang w:val="en-US"/>
+        </w:rPr>
+        <w:t>Learning center resources</w:t>
+      </w:r>
+    </w:p>
+    <w:p>
+      <w:pPr>
+        <w:pStyle w:val="ListParagraph"/>
+        <w:numPr>
+          <w:ilvl w:val="0"/>
+          <w:numId w:val="5"/>
+        </w:numPr>
+        <w:rPr>
+          <w:lang w:val="en-US"/>
+        </w:rPr>
+      </w:pPr>
+      <w:r>
+        <w:rPr>
+          <w:b/>
+          <w:bCs/>
+          <w:lang w:val="en-US"/>
+        </w:rPr>
+        <w:t>Preparedness kit red cross</w:t>
+      </w:r>
+    </w:p>
+    <w:p>
+      <w:pPr>
+        <w:pStyle w:val="ListParagraph"/>
+        <w:numPr>
+          <w:ilvl w:val="0"/>
+          <w:numId w:val="5"/>
+        </w:numPr>
+        <w:rPr>
+          <w:b/>
+          <w:bCs/>
+          <w:lang w:val="en-US"/>
+        </w:rPr>
+      </w:pPr>
+      <w:hyperlink r:id="rId14" w:history="1">
+        <w:r>
+          <w:rPr>
+            <w:rStyle w:val="Hyperlink"/>
+            <w:lang w:val="en-US"/>
+          </w:rPr>
+          <w:t>https://www.roteskreuz.at/katastrophenvorsorge?gad_source=1&amp;gad_campaignid=1810993325&amp;gbraid=0AAAAADv0o5Z0J0uzz-a9Zv5YPMjcvMKQi&amp;gclid=CjwKCAjwuO_QBhAWEiwAIkVhUzjdzeOwjE7VdC42s3wp7Y5nByp2mquK1BsDDzHw2fjK-TzZn-eXgBoC7kYQAvD_BwE</w:t>
+        </w:r>
+      </w:hyperlink>
+      <w:r>
+        <w:rPr>
+          <w:lang w:val="en-US"/>
+        </w:rPr>
+        <w:t xml:space="preserve"> </w:t>
+      </w:r>
+    </w:p>
+    <w:p>
+      <w:pPr>
+        <w:rPr>
+          <w:b/>
+          <w:bCs/>
+          <w:lang w:val="en-US"/>
+        </w:rPr>
+      </w:pPr>
+    </w:p>
+    <w:p>
+      <w:pPr>
+        <w:pStyle w:val="ListParagraph"/>
+        <w:numPr>
+          <w:ilvl w:val="0"/>
+          <w:numId w:val="5"/>
+        </w:numPr>
+        <w:rPr>
+          <w:b/>
+          <w:bCs/>
+          <w:lang w:val="en-US"/>
+        </w:rPr>
+      </w:pPr>
+      <w:r>
+        <w:rPr>
+          <w:b/>
+          <w:bCs/>
+          <w:lang w:val="en-US"/>
+        </w:rPr>
+        <w:t>Zivilschutzverband</w:t>
+      </w:r>
+    </w:p>
+    <w:p>
+      <w:pPr>
+        <w:pStyle w:val="ListParagraph"/>
+        <w:rPr>
+          <w:b/>
+          <w:bCs/>
+          <w:lang w:val="en-US"/>
+        </w:rPr>
+      </w:pPr>
+    </w:p>
+    <w:p>
+      <w:pPr>
+        <w:pStyle w:val="ListParagraph"/>
+        <w:numPr>
+          <w:ilvl w:val="0"/>
+          <w:numId w:val="5"/>
+        </w:numPr>
+        <w:rPr>
+          <w:lang w:val="en-US"/>
+        </w:rPr>
+      </w:pPr>
+      <w:r>
+        <w:rPr>
+          <w:lang w:val="en-US"/>
+        </w:rPr>
+        <w:t xml:space="preserve">Emergency kit </w:t>
+      </w:r>
+      <w:hyperlink r:id="rId15" w:history="1">
+        <w:r>
+          <w:rPr>
+            <w:rStyle w:val="Hyperlink"/>
+            <w:lang w:val="en-US"/>
+          </w:rPr>
+          <w:t>https://zivilschutz.at/en/thema/crisis-proof-household-2/</w:t>
+        </w:r>
+      </w:hyperlink>
+      <w:r>
+        <w:rPr>
+          <w:lang w:val="en-US"/>
+        </w:rPr>
+        <w:t xml:space="preserve"> </w:t>
+      </w:r>
     </w:p>
     <w:sectPr>
       <w:pgSz w:w="11906" w:h="16838"/>

</xml_diff>